<commit_message>
Fase 1: Definición de Proyecto v1.1 con calendario ajustado y registro de cambios
La v1.0 queda en el historial de git (commit ceaba2e) y como copia local.
La distribución posterior a la semana 12 es una propuesta pendiente de la
conformidad del docente.

Co-Authored-By: Claude Sonnet 5.5 <noreply@anthropic.com>
</commit_message>
<xml_diff>
--- a/Fase 1/1.5_APT122_DefinicionProyecto_JohaoRamirez.docx
+++ b/Fase 1/1.5_APT122_DefinicionProyecto_JohaoRamirez.docx
@@ -376,6 +376,14 @@
       </w:r>
     </w:p>
     <w:p>
+      <w:r>
+        <w:rPr>
+          <w:b/>
+        </w:rPr>
+        <w:t xml:space="preserve">Versión 1.1 (30-10-2026): ajuste de calendario, pendiente de la conformidad del docente. Ver el registro de cambios antes de la sección 8.</w:t>
+      </w:r>
+    </w:p>
+    <w:p>
       <w:pPr>
         <w:pStyle w:val="Prrafodelista"/>
         <w:numPr>
@@ -1929,17 +1937,17 @@
           </w:p>
           <w:p>
             <w:r>
-              <w:t>Etapa 1 — Análisis y especificación de requisitos (semanas 5–6): levantamiento de requisitos funcionales y no funcionales, definición de roles y permisos, e historias de usuario por rol. Entregable: Especificación de Requisitos de Software (SRS) simplificada. Puerta de control: SRS aprobada; los cambios posteriores se registran y se evalúan por su impacto en alcance y cronograma.</w:t>
-            </w:r>
-          </w:p>
-          <w:p>
-            <w:r>
-              <w:t>Etapa 2 — Diseño (semanas 6–7): arquitectura y diagrama de componentes, modelo entidad-relación para PostgreSQL, esquema documental para MongoDB, diagramas UML (casos de uso, clases, secuencia y componentes) y plan de pruebas. Entregable: Documento de Diseño. Puerta de control: línea base de diseño congelada antes de comenzar la construcción.</w:t>
-            </w:r>
-          </w:p>
-          <w:p>
-            <w:r>
-              <w:t>Etapa 3 — Construcción (semanas 8–14): implementación en orden de dependencia técnica, según el diseño aprobado: pipeline genómico y banco de fagos (semanas 8–10, cierre del Informe de Avance), modelo predictivo con explicabilidad (semanas 11–12), plataforma web con control de acceso, auditoría y tablero (semanas 13–14) y aplicación móvil (semana 14). Entregable: sistema integrado sobre Docker en el repositorio público. Puerta de control: componentes integrados y ejecutándose sin pasos manuales no documentados.</w:t>
+              <w:t>Etapa 1 — Análisis y especificación de requisitos (semanas 5–12): levantamiento de requisitos funcionales y no funcionales, definición de roles y permisos, e historias de usuario por rol. Entregable: Especificación de Requisitos de Software (SRS) simplificada. Puerta de control: SRS aprobada; los cambios posteriores se registran y se evalúan por su impacto en alcance y cronograma.</w:t>
+            </w:r>
+          </w:p>
+          <w:p>
+            <w:r>
+              <w:t>Etapa 2 — Diseño (semanas 6–12): arquitectura y diagrama de componentes, modelo entidad-relación para PostgreSQL, esquema documental para MongoDB, diagramas UML (casos de uso, clases, secuencia y componentes) y plan de pruebas. Entregable: Documento de Diseño. Puerta de control: línea base de diseño congelada antes de comenzar la construcción.</w:t>
+            </w:r>
+          </w:p>
+          <w:p>
+            <w:r>
+              <w:t>Etapa 3 — Construcción (semanas 8–15): implementación en orden de dependencia técnica, según el diseño aprobado: pipeline genómico y banco de fagos (semanas 8–13; el primer corte cierra con el Informe de Avance, semana 12), modelo predictivo con explicabilidad (semanas 13–14), plataforma web con control de acceso, auditoría y tablero (semanas 13–15) y aplicación móvil (semana 14). Entregable: sistema integrado sobre Docker en el repositorio público. Puerta de control: componentes integrados y ejecutándose sin pasos manuales no documentados.</w:t>
             </w:r>
           </w:p>
           <w:p>
@@ -2346,7 +2354,7 @@
           </w:tcPr>
           <w:p>
             <w:r>
-              <w:t>Código fuente, Dockerfile y docker-compose, y registros de ejecución del pipeline de ingesta, control de calidad, identificación de especie y tipificación de aislados, junto con el banco de fagos curado y poblado desde INPHARED, PhageScope y MVP.</w:t>
+              <w:t>Código fuente, Dockerfile y docker-compose, y registros de ejecución del pipeline de ingesta, control de calidad, identificación de especie y tipificación de aislados, junto con el banco de fagos poblado desde INPHARED (200 genomas de Klebsiella pneumoniae); PhageScope y MVP se suman en la semana 13.</w:t>
             </w:r>
           </w:p>
         </w:tc>
@@ -2356,7 +2364,7 @@
           </w:tcPr>
           <w:p>
             <w:r>
-              <w:t>Evidencia el cumplimiento de los objetivos específicos 1 y 2, y el estándar de reproducibilidad exigido por el Anexo 1 del Instructivo.</w:t>
+              <w:t>Evidencia el cumplimiento del objetivo específico 1 y el primer corte funcional del objetivo específico 2, y el estándar de reproducibilidad exigido por el Anexo 1 del Instructivo.</w:t>
             </w:r>
           </w:p>
         </w:tc>
@@ -2970,7 +2978,7 @@
           </w:tcPr>
           <w:p>
             <w:r>
-              <w:t>Semanas 5–6</w:t>
+              <w:t>Semanas 5–12</w:t>
             </w:r>
           </w:p>
         </w:tc>
@@ -3091,7 +3099,7 @@
           </w:tcPr>
           <w:p>
             <w:r>
-              <w:t>Semanas 6–7</w:t>
+              <w:t>Semanas 6–12</w:t>
             </w:r>
           </w:p>
         </w:tc>
@@ -3234,7 +3242,7 @@
           </w:tcPr>
           <w:p>
             <w:r>
-              <w:t>Semanas 8–10</w:t>
+              <w:t>Semanas 8–13</w:t>
             </w:r>
           </w:p>
         </w:tc>
@@ -3258,7 +3266,7 @@
           </w:tcPr>
           <w:p>
             <w:r>
-              <w:t>Cierre coincide con el Informe de Avance (semana 10). Riesgo: heterogeneidad de metadatos entre fuentes.</w:t>
+              <w:t>El primer corte cierra con el Informe de Avance (semana 12); el cierre completo pasa a la semana 13. Riesgo: heterogeneidad de metadatos entre fuentes.</w:t>
             </w:r>
           </w:p>
         </w:tc>
@@ -3344,7 +3352,7 @@
           </w:tcPr>
           <w:p>
             <w:r>
-              <w:t>Semanas 11–12</w:t>
+              <w:t>Semanas 13–14</w:t>
             </w:r>
           </w:p>
         </w:tc>
@@ -3465,7 +3473,7 @@
           </w:tcPr>
           <w:p>
             <w:r>
-              <w:t>Semanas 13–14</w:t>
+              <w:t>Semanas 13–15</w:t>
             </w:r>
           </w:p>
         </w:tc>
@@ -3863,6 +3871,29 @@
             <w:tcW w:w="9640" w:type="dxa"/>
             <w:vAlign w:val="center"/>
           </w:tcPr>
+          <w:p>
+            <w:r>
+              <w:rPr>
+                <w:b/>
+              </w:rPr>
+              <w:t xml:space="preserve">Registro de cambios — versión 1.1 (30-10-2026)</w:t>
+            </w:r>
+          </w:p>
+          <w:p>
+            <w:r>
+              <w:t xml:space="preserve">Esta versión ajusta el calendario por el plazo que el docente indicó el 29-10-2026 para la entrega 2 (30-10, semana 12). Los objetivos, el alcance y las actividades no cambian; la distribución posterior a la semana 12 es una propuesta que requiere la conformidad del docente. La versión 1.0, entregada en la Fase 1, se conserva sin cambios.</w:t>
+            </w:r>
+          </w:p>
+          <w:p>
+            <w:r>
+              <w:t xml:space="preserve">Valores de la versión 1.0 que cambian: etapa 1, semanas 5–6 (ahora 5–12); etapa 2, semanas 6–7 (ahora 6–12); pipeline genómico y banco de fagos, semanas 8–10 (ahora 8–13, con un primer corte en la semana 12); modelo de predicción, semanas 11–12 (ahora 13–14); plataforma web, semanas 13–14 (ahora 13–15); construcción en conjunto, semanas 8–14 (ahora 8–15). La evidencia de avance sobre el pipeline y el banco de fagos pasa de «poblado desde INPHARED, PhageScope y MVP» a «poblado desde INPHARED, con PhageScope y MVP en la semana 13».</w:t>
+            </w:r>
+          </w:p>
+          <w:p>
+            <w:r>
+              <w:t xml:space="preserve">La Carta Gantt de la sección 8 se conserva como línea base de la versión 1.0; el calendario vigente es el de las secciones 5 y 7. El detalle de los ajustes está en el Informe de Avance (sección 3.2, ajuste A6).</w:t>
+            </w:r>
+          </w:p>
           <w:p>
             <w:pPr>
               <w:rPr>

</xml_diff>

<commit_message>
Fase 1: Definición de Proyecto v1.1 con un único objetivo específico
Reemplaza los cinco objetivos específicos por un objetivo amplio y
reformula las evidencias y el plan de trabajo por componente. El registro
de cambios conserva los objetivos de la v1.0. Pendiente de la conformidad
del docente.

Co-Authored-By: Claude Sonnet 5.5 <noreply@anthropic.com>
</commit_message>
<xml_diff>
--- a/Fase 1/1.5_APT122_DefinicionProyecto_JohaoRamirez.docx
+++ b/Fase 1/1.5_APT122_DefinicionProyecto_JohaoRamirez.docx
@@ -380,7 +380,7 @@
         <w:rPr>
           <w:b/>
         </w:rPr>
-        <w:t xml:space="preserve">Versión 1.1 (30-10-2026): ajuste de calendario, pendiente de la conformidad del docente. Ver el registro de cambios antes de la sección 8.</w:t>
+        <w:t xml:space="preserve">Versión 1.1 (30-10-2026): ajuste de calendario y objetivo específico único, pendiente de la conformidad del docente. Ver el registro de cambios antes de la sección 8.</w:t>
       </w:r>
     </w:p>
     <w:p>
@@ -1620,7 +1620,7 @@
                 <w:rFonts w:ascii="Calibri" w:hAnsi="Calibri"/>
                 <w:color w:val="1F3864" w:themeColor="accent1" w:themeShade="80"/>
               </w:rPr>
-              <w:t xml:space="preserve">Objetivos </w:t>
+              <w:t xml:space="preserve">Objetivo </w:t>
             </w:r>
             <w:r>
               <w:rPr>
@@ -1634,7 +1634,7 @@
                 <w:rFonts w:ascii="Calibri" w:hAnsi="Calibri"/>
                 <w:color w:val="1F3864" w:themeColor="accent1" w:themeShade="80"/>
               </w:rPr>
-              <w:t>specíficos</w:t>
+              <w:t>specífico</w:t>
             </w:r>
           </w:p>
         </w:tc>
@@ -1656,27 +1656,7 @@
               </w:rPr>
             </w:pPr>
             <w:r>
-              <w:t>1. Especificar los requisitos y diseñar la solución, levantando los requisitos funcionales y no funcionales del proceso de selección de fagos, definiendo los roles y sus permisos, y elaborando la arquitectura, el modelo de datos y los diagramas UML del sistema.</w:t>
-            </w:r>
-          </w:p>
-          <w:p>
-            <w:r>
-              <w:t>2. Construir el pipeline de procesamiento genómico y poblar el banco de fagos, implementando la ingesta, el control de calidad, la identificación de especie y la tipificación de aislados bacterianos, y la carga curada de genomas de fagos desde las fuentes públicas seleccionadas.</w:t>
-            </w:r>
-          </w:p>
-          <w:p>
-            <w:r>
-              <w:t>3. Implementar y evaluar el modelo de predicción de compatibilidad fago-hospedador a nivel de cepa para Klebsiella pneumoniae, midiendo su desempeño contra las métricas reportadas en la literatura e incorporando explicabilidad de las predicciones.</w:t>
-            </w:r>
-          </w:p>
-          <w:p>
-            <w:r>
-              <w:t>4. Desarrollar la plataforma web, implementando la gestión del ciclo de vida de solicitudes, el control de acceso por rol, el registro de auditoría y el tablero de cobertura y tendencias.</w:t>
-            </w:r>
-          </w:p>
-          <w:p>
-            <w:r>
-              <w:t>5. Desarrollar la aplicación móvil complementaria y validar la calidad del sistema, ejecutando el plan de pruebas unitarias, de integración y de seguridad definido.</w:t>
+              <w:t>Especificar, construir y validar los componentes de la plataforma —pipeline genómico y banco de fagos, modelo de predicción, plataforma web con control de acceso, auditoría y tablero, y aplicación móvil complementaria— siguiendo el ciclo de vida definido y el plan de pruebas unitarias, de integración y de seguridad.</w:t>
             </w:r>
           </w:p>
         </w:tc>
@@ -2319,7 +2299,7 @@
           </w:tcPr>
           <w:p>
             <w:r>
-              <w:t>Evidencia el cumplimiento del objetivo específico 1 y las competencias de ingeniería de requisitos y diseño de la solución.</w:t>
+              <w:t>Evidencia el avance del objetivo específico en su componente de especificación y diseño, y las competencias de ingeniería de requisitos y diseño de la solución.</w:t>
             </w:r>
           </w:p>
         </w:tc>
@@ -2364,7 +2344,7 @@
           </w:tcPr>
           <w:p>
             <w:r>
-              <w:t>Evidencia el cumplimiento del objetivo específico 1 y el primer corte funcional del objetivo específico 2, y el estándar de reproducibilidad exigido por el Anexo 1 del Instructivo.</w:t>
+              <w:t>Evidencia el avance del objetivo específico en su componente de pipeline y banco de fagos (primer corte funcional), y el estándar de reproducibilidad exigido por el Anexo 1 del Instructivo.</w:t>
             </w:r>
           </w:p>
         </w:tc>
@@ -2409,7 +2389,7 @@
           </w:tcPr>
           <w:p>
             <w:r>
-              <w:t>Evidencia el cumplimiento del objetivo específico 3 y sustenta técnicamente la recomendación que entrega la plataforma.</w:t>
+              <w:t>Evidencia el avance del objetivo específico en su componente de modelo de predicción y sustenta técnicamente la recomendación que entrega la plataforma.</w:t>
             </w:r>
           </w:p>
         </w:tc>
@@ -2454,7 +2434,7 @@
           </w:tcPr>
           <w:p>
             <w:r>
-              <w:t>Evidencia el cumplimiento del objetivo específico 4 y constituye el entregable central del proyecto.</w:t>
+              <w:t>Evidencia el avance del objetivo específico en su componente de plataforma web y constituye el entregable central del proyecto.</w:t>
             </w:r>
           </w:p>
         </w:tc>
@@ -2499,7 +2479,7 @@
           </w:tcPr>
           <w:p>
             <w:r>
-              <w:t>Evidencia el cumplimiento del objetivo específico 5 y las competencias de desarrollo móvil y de calidad de software.</w:t>
+              <w:t>Evidencia el avance del objetivo específico en sus componentes de aplicación móvil y calidad, y las competencias de desarrollo móvil y de calidad de software.</w:t>
             </w:r>
           </w:p>
         </w:tc>
@@ -2907,7 +2887,7 @@
           </w:tcPr>
           <w:p>
             <w:r>
-              <w:t>OE1 — Ingeniería de requisitos y diseño de la solución</w:t>
+              <w:t>Ingeniería de requisitos y diseño de la solución</w:t>
             </w:r>
           </w:p>
         </w:tc>
@@ -3017,7 +2997,7 @@
           </w:tcPr>
           <w:p>
             <w:r>
-              <w:t>OE1 — Ingeniería de requisitos y diseño de la solución</w:t>
+              <w:t>Ingeniería de requisitos y diseño de la solución</w:t>
             </w:r>
           </w:p>
         </w:tc>
@@ -3138,7 +3118,7 @@
           </w:tcPr>
           <w:p>
             <w:r>
-              <w:t>OE2 — Construcción de software y modelamiento de datos</w:t>
+              <w:t>Construcción de software y modelamiento de datos</w:t>
             </w:r>
           </w:p>
         </w:tc>
@@ -3281,7 +3261,7 @@
           </w:tcPr>
           <w:p>
             <w:r>
-              <w:t>OE3 — Minería de datos y analítica</w:t>
+              <w:t>Minería de datos y analítica</w:t>
             </w:r>
           </w:p>
         </w:tc>
@@ -3391,7 +3371,7 @@
           </w:tcPr>
           <w:p>
             <w:r>
-              <w:t>OE4 — Desarrollo web, seguridad e inteligencia de negocio</w:t>
+              <w:t>Desarrollo web, seguridad e inteligencia de negocio</w:t>
             </w:r>
           </w:p>
         </w:tc>
@@ -3512,7 +3492,7 @@
           </w:tcPr>
           <w:p>
             <w:r>
-              <w:t>OE5 — Desarrollo móvil y aseguramiento de la calidad</w:t>
+              <w:t>Desarrollo móvil y aseguramiento de la calidad</w:t>
             </w:r>
           </w:p>
         </w:tc>
@@ -3600,7 +3580,7 @@
           </w:tcPr>
           <w:p>
             <w:r>
-              <w:t>OE5 — Desarrollo móvil y aseguramiento de la calidad</w:t>
+              <w:t>Desarrollo móvil y aseguramiento de la calidad</w:t>
             </w:r>
           </w:p>
         </w:tc>
@@ -3881,12 +3861,22 @@
           </w:p>
           <w:p>
             <w:r>
-              <w:t xml:space="preserve">Esta versión ajusta el calendario por el plazo que el docente indicó el 29-10-2026 para la entrega 2 (30-10, semana 12). Los objetivos, el alcance y las actividades no cambian; la distribución posterior a la semana 12 es una propuesta que requiere la conformidad del docente. La versión 1.0, entregada en la Fase 1, se conserva sin cambios.</w:t>
+              <w:t xml:space="preserve">Esta versión ajusta el calendario por el plazo que el docente indicó el 29-10-2026 para la entrega 2 (30-10, semana 12) y reemplaza los cinco objetivos específicos por un único objetivo específico amplio. El alcance y las actividades no cambian. La distribución posterior a la semana 12 y el cambio de objetivos son propuestas que requieren la conformidad del docente. La versión 1.0, entregada en la Fase 1, se conserva sin cambios.</w:t>
             </w:r>
           </w:p>
           <w:p>
             <w:r>
               <w:t xml:space="preserve">Valores de la versión 1.0 que cambian: etapa 1, semanas 5–6 (ahora 5–12); etapa 2, semanas 6–7 (ahora 6–12); pipeline genómico y banco de fagos, semanas 8–10 (ahora 8–13, con un primer corte en la semana 12); modelo de predicción, semanas 11–12 (ahora 13–14); plataforma web, semanas 13–14 (ahora 13–15); construcción en conjunto, semanas 8–14 (ahora 8–15). La evidencia de avance sobre el pipeline y el banco de fagos pasa de «poblado desde INPHARED, PhageScope y MVP» a «poblado desde INPHARED, con PhageScope y MVP en la semana 13».</w:t>
+            </w:r>
+          </w:p>
+          <w:p>
+            <w:r>
+              <w:t xml:space="preserve">Objetivos específicos de la versión 1.0, reemplazados por el objetivo único: 1. Especificar los requisitos y diseñar la solución; 2. Construir el pipeline de procesamiento genómico y poblar el banco de fagos; 3. Implementar y evaluar el modelo de predicción de compatibilidad fago-hospedador a nivel de cepa para Klebsiella pneumoniae; 4. Desarrollar la plataforma web; 5. Desarrollar la aplicación móvil complementaria y validar la calidad del sistema. El texto completo de cada uno está en la versión 1.0.</w:t>
+            </w:r>
+          </w:p>
+          <w:p>
+            <w:r>
+              <w:t xml:space="preserve">En las evidencias y en el plan de trabajo, las referencias «objetivo específico 1 a 5» y «OE1 a OE5» se reformularon por componente. El Informe de Avance, la SRS y el Documento de Diseño conservan por ahora la referencia a los cinco objetivos de la versión 1.0.</w:t>
             </w:r>
           </w:p>
           <w:p>

</xml_diff>